<commit_message>
Drive-knopnamen gelijkgetrokken met de Nederlandse Google-hulp
Nagekeken op 23-09-2026 in support.google.com/drive/answer/2494822 en
/2375091 (hl=nl):

- Rol Lezer heet nu Kijker (lespagina, dia's, woordenlijst, zelftest,
  theoriekaart, lesvoorbereiding, lesfiche, README, Portfoliopaspoort).
  Woordenlijst: sleutel 'lezer' -> 'kijker'.
- Delen: de verzendknop heet Sturen (soms Delen), niet Verzenden.
- Map maken: Nieuw > Map, naam typen, Maken (was + Nieuw > Nieuwe map).
- Organiseren heet Ordenen: Verplaatsen, Kleur van map (was Mapkleur),
  Toevoegen aan Met ster.
- Screenshot-plaats les2-delen-lezer.png heet nu les2-delen-kijker.png.
- Portfoliopaspoort.docx opnieuw gegenereerd; de rommelbestanden
  veranderden inhoudelijk niet en zijn niet opnieuw gegenereerd.

De waarschuwingen tegen een map met de naam "Nieuwe map" blijven staan:
dat is een slechte mapnaam, geen knop.

Co-Authored-By: Claude Opus 5.5 <noreply@anthropic.com>
</commit_message>
<xml_diff>
--- a/werkdocument/Portfoliopaspoort.docx
+++ b/werkdocument/Portfoliopaspoort.docx
@@ -573,7 +573,7 @@
           <w:b/>
           <w:i w:val="0"/>
         </w:rPr>
-        <w:t>Vraag 4. Je deelde je map met je leraar als Lezer. Noem één ding dat je leraar nu WÉL mag doen en één ding dat je leraar NIET mag doen.</w:t>
+        <w:t>Vraag 4. Je deelde je map met je leraar als Kijker. Noem één ding dat je leraar nu WÉL mag doen en één ding dat je leraar NIET mag doen.</w:t>
       </w:r>
     </w:p>
     <w:p>
@@ -743,7 +743,7 @@
         <w:spacing w:after="40"/>
       </w:pPr>
       <w:r>
-        <w:t>☐  Mijn map is gedeeld met mijn leraar als Lezer.</w:t>
+        <w:t>☐  Mijn map is gedeeld met mijn leraar als Kijker.</w:t>
       </w:r>
     </w:p>
     <w:p>

</xml_diff>